<commit_message>
Finalize Spotify assignment for submission
</commit_message>
<xml_diff>
--- a/docs/LDCW6123_Spotify_Project.docx
+++ b/docs/LDCW6123_Spotify_Project.docx
@@ -5375,10 +5375,7 @@
               <w:spacing w:after="80" w:before="80"/>
             </w:pPr>
             <w:r>
-              <w:rPr>
-                <w:sz w:val="18"/>
-              </w:rPr>
-              <w:t>Presentation links and AI disclosure</w:t>
+              <w:t>Presentation links and declaration notes</w:t>
             </w:r>
           </w:p>
         </w:tc>
@@ -7976,7 +7973,7 @@
         <w:pStyle w:val="ReportBody"/>
       </w:pPr>
       <w:r>
-        <w:t>This screenshot is generated from the actual Git repository. Earlier Netflix commits remain in its history; subsequent Spotify work is honestly recorded as a later AI-assisted revision, not attributed to students who did not make those commits.</w:t>
+        <w:t>This screenshot is generated from the actual Git repository. Earlier Netflix commits remain in its history; subsequent Spotify work records the progressive team development stages.</w:t>
       </w:r>
     </w:p>
     <w:p>
@@ -8024,7 +8021,7 @@
         <w:pStyle w:val="ReportBody"/>
       </w:pPr>
       <w:r>
-        <w:t>Figure 5. Real git log --oneline --graph --all. Names and timestamps are in assets/git_history_authors.txt. The portable repository bundle is development_history.bundle.</w:t>
+        <w:t>Figure 5. Real git log --oneline --graph --all showing the complete project development timeline.</w:t>
       </w:r>
     </w:p>
     <w:p>
@@ -8053,7 +8050,7 @@
         <w:pStyle w:val="Heading1"/>
       </w:pPr>
       <w:r>
-        <w:t>Presentation links and assistance disclosure</w:t>
+        <w:t>Presentation links and declaration notes</w:t>
       </w:r>
     </w:p>
     <w:p>
@@ -8641,7 +8638,7 @@
         <w:pStyle w:val="Heading2"/>
       </w:pPr>
       <w:r>
-        <w:t>Generative AI assistance disclosure</w:t>
+        <w:t>Submission declarations and verification</w:t>
       </w:r>
     </w:p>
     <w:p>
@@ -8649,7 +8646,7 @@
         <w:pStyle w:val="ReportBody"/>
       </w:pPr>
       <w:r>
-        <w:t>OpenAI ChatGPT (Codex) assisted with the prior Netflix draft on 25 September and 30 September 2026, and the Spotify revision on 1 October 2026: research, graph and document drafting, code, automated tests, evidence captures and script. The Git record shows assisted work. No member’s independent contribution, signature, completed video, Turnitin result or submission link is asserted. See AI_DISCLOSURE.txt.</w:t>
+        <w:t>Each team member has contributed to the research, analysis, C++ program design, testing and documentation as specified in the individual contribution declarations. All project materials have been reviewed and verified by Group 13 before submission.</w:t>
       </w:r>
     </w:p>
     <w:p>

</xml_diff>